<commit_message>
Update AIGC video system
</commit_message>
<xml_diff>
--- a/题目要求.docx
+++ b/题目要求.docx
@@ -8279,7 +8279,7 @@
           <w:szCs w:val="24"/>
           <w:lang w:val="en-US" w:eastAsia="zh-CN" w:bidi="ar"/>
         </w:rPr>
-        <w:t>APIKEY：ark-f7e30cd6-8faf-43ce-9147-72e411a8db22-a3c54</w:t>
+        <w:t>APIKEY：ark-REDACTED</w:t>
       </w:r>
     </w:p>
     <w:p>
@@ -8399,7 +8399,7 @@
           <w:szCs w:val="24"/>
           <w:lang w:val="en-US" w:eastAsia="zh-CN" w:bidi="ar"/>
         </w:rPr>
-        <w:t>APIKEY：ark-f7e30cd6-8faf-43ce-9147-72e411a8db22-a3c54</w:t>
+        <w:t>APIKEY：ark-REDACTED</w:t>
       </w:r>
     </w:p>
     <w:p>

</xml_diff>